<commit_message>
Restrict binary chip alphabet to supported symbols
</commit_message>
<xml_diff>
--- a/sprawozdanie.docx
+++ b/sprawozdanie.docx
@@ -297,48 +297,6 @@
             </w:pPr>
             <w:r>
               <w:t>A, T</w:t>
-            </w:r>
-          </w:p>
-        </w:tc>
-      </w:tr>
-      <w:tr>
-        <w:tc>
-          <w:tcPr>
-            <w:tcW w:type="dxa" w:w="2268"/>
-            <w:vAlign w:val="center"/>
-            <w:tcMar>
-              <w:top w:w="80" w:type="dxa"/>
-              <w:start w:w="100" w:type="dxa"/>
-              <w:bottom w:w="80" w:type="dxa"/>
-              <w:end w:w="100" w:type="dxa"/>
-            </w:tcMar>
-          </w:tcPr>
-          <w:p>
-            <w:pPr>
-              <w:spacing w:after="0" w:line="240" w:lineRule="auto"/>
-            </w:pPr>
-            <w:r>
-              <w:t>N / Z / P</w:t>
-            </w:r>
-          </w:p>
-        </w:tc>
-        <w:tc>
-          <w:tcPr>
-            <w:tcW w:type="dxa" w:w="5669"/>
-            <w:vAlign w:val="center"/>
-            <w:tcMar>
-              <w:top w:w="80" w:type="dxa"/>
-              <w:start w:w="100" w:type="dxa"/>
-              <w:bottom w:w="80" w:type="dxa"/>
-              <w:end w:w="100" w:type="dxa"/>
-            </w:tcMar>
-          </w:tcPr>
-          <w:p>
-            <w:pPr>
-              <w:spacing w:after="0" w:line="240" w:lineRule="auto"/>
-            </w:pPr>
-            <w:r>
-              <w:t>A, C, G, T</w:t>
             </w:r>
           </w:p>
         </w:tc>

</xml_diff>